<commit_message>
docs: add dedicated Student and Teacher portal sections to Principal presentation dossier
</commit_message>
<xml_diff>
--- a/docs/GHSS_Shangus_Platform_Presentation_Principal.docx
+++ b/docs/GHSS_Shangus_Platform_Presentation_Principal.docx
@@ -98,7 +98,7 @@
                 <w:sz w:val="20"/>
                 <w:szCs w:val="20"/>
               </w:rPr>
-              <w:t xml:space="preserve">This comprehensive brief demonstrates the digital transformation of Govt. Higher Secondary School Shangus into a modern, state-of-the-art educational institution. Equipped with 20 specialized administrative modules, two decades of historical student records digitized since 2006, sub-second execution speeds, and impenetrable cloud security, this platform establishes GHSS Shangus as a premier model school in District Anantnag and Jammu &amp; Kashmir.</w:t>
+              <w:t xml:space="preserve">This dossier presents the digital architecture of Govt. Higher Secondary School Shangus. Combining 20 specialized administrative tools, dedicated Student &amp; Teacher Portals, two decades of historical student admission records digitized since 2006, sub-second execution speeds, and impenetrable security, this platform establishes GHSS Shangus as a premier model school in District Anantnag and Jammu &amp; Kashmir.</w:t>
             </w:r>
           </w:p>
         </w:tc>
@@ -260,6 +260,434 @@
         <w:spacing w:before="280" w:after="120"/>
       </w:pPr>
       <w:r>
+        <w:t xml:space="preserve">Student Self-Service Portal &amp; Dashboard Capabilities</w:t>
+      </w:r>
+    </w:p>
+    <w:p>
+      <w:r>
+        <w:rPr>
+          <w:color w:val="334155"/>
+        </w:rPr>
+        <w:t xml:space="preserve">The Student Portal empowers learners and parents with a transparent, self-service digital experience accessible 24/7 from any smartphone:</w:t>
+      </w:r>
+    </w:p>
+    <w:p>
+      <w:pPr>
+        <w:pStyle w:val="ListParagraph"/>
+        <w:numPr>
+          <w:ilvl w:val="0"/>
+          <w:numId w:val="1"/>
+        </w:numPr>
+        <w:spacing w:before="40" w:after="60"/>
+      </w:pPr>
+      <w:r>
+        <w:rPr>
+          <w:b/>
+          <w:bCs/>
+          <w:color w:val="0F3460"/>
+        </w:rPr>
+        <w:t xml:space="preserve">Multi-Class Online Admission Gateway: </w:t>
+      </w:r>
+      <w:r>
+        <w:rPr>
+          <w:color w:val="334155"/>
+        </w:rPr>
+        <w:t xml:space="preserve">Step-by-step application submission for Classes 9, 10, 11, and 12. Enforces stream selection rules (Medical, Non-Medical, Arts/Humanities, Commerce, Vocational) and validates subject combinations dynamically.</w:t>
+      </w:r>
+    </w:p>
+    <w:p>
+      <w:pPr>
+        <w:pStyle w:val="ListParagraph"/>
+        <w:numPr>
+          <w:ilvl w:val="0"/>
+          <w:numId w:val="1"/>
+        </w:numPr>
+        <w:spacing w:before="40" w:after="60"/>
+      </w:pPr>
+      <w:r>
+        <w:rPr>
+          <w:b/>
+          <w:bCs/>
+          <w:color w:val="0F3460"/>
+        </w:rPr>
+        <w:t xml:space="preserve">Real-Time Application Lifecycle Tracking: </w:t>
+      </w:r>
+      <w:r>
+        <w:rPr>
+          <w:color w:val="334155"/>
+        </w:rPr>
+        <w:t xml:space="preserve">Students monitor their exact admission status with prominent badges: Submitted, Under Review, Approved, Provisional, Full Admission, or Roll Number Assigned, tied directly to the active academic session.</w:t>
+      </w:r>
+    </w:p>
+    <w:p>
+      <w:pPr>
+        <w:pStyle w:val="ListParagraph"/>
+        <w:numPr>
+          <w:ilvl w:val="0"/>
+          <w:numId w:val="1"/>
+        </w:numPr>
+        <w:spacing w:before="40" w:after="60"/>
+      </w:pPr>
+      <w:r>
+        <w:rPr>
+          <w:b/>
+          <w:bCs/>
+          <w:color w:val="0F3460"/>
+        </w:rPr>
+        <w:t xml:space="preserve">Provisional-to-Full Admission Upgrade Engine: </w:t>
+      </w:r>
+      <w:r>
+        <w:rPr>
+          <w:color w:val="334155"/>
+        </w:rPr>
+        <w:t xml:space="preserve">Students admitted provisionally (awaiting board results or marksheets) can seamlessly upgrade their admission to Full Admission once marks cards are available with zero duplicate form filing.</w:t>
+      </w:r>
+    </w:p>
+    <w:p>
+      <w:pPr>
+        <w:pStyle w:val="ListParagraph"/>
+        <w:numPr>
+          <w:ilvl w:val="0"/>
+          <w:numId w:val="1"/>
+        </w:numPr>
+        <w:spacing w:before="40" w:after="60"/>
+      </w:pPr>
+      <w:r>
+        <w:rPr>
+          <w:b/>
+          <w:bCs/>
+          <w:color w:val="0F3460"/>
+        </w:rPr>
+        <w:t xml:space="preserve">Digital Document Locker: </w:t>
+      </w:r>
+      <w:r>
+        <w:rPr>
+          <w:color w:val="334155"/>
+        </w:rPr>
+        <w:t xml:space="preserve">Secure uploads and previews for student photographs, marks cards, Aadhaar cards, date of birth certificates, category proofs, and bank passbooks with automatic image compression.</w:t>
+      </w:r>
+    </w:p>
+    <w:p>
+      <w:pPr>
+        <w:pStyle w:val="ListParagraph"/>
+        <w:numPr>
+          <w:ilvl w:val="0"/>
+          <w:numId w:val="1"/>
+        </w:numPr>
+        <w:spacing w:before="40" w:after="60"/>
+      </w:pPr>
+      <w:r>
+        <w:rPr>
+          <w:b/>
+          <w:bCs/>
+          <w:color w:val="0F3460"/>
+        </w:rPr>
+        <w:t xml:space="preserve">1-Click Official PDF Generation: </w:t>
+      </w:r>
+      <w:r>
+        <w:rPr>
+          <w:color w:val="334155"/>
+        </w:rPr>
+        <w:t xml:space="preserve">Generates high-resolution, print-ready Admission Confirmation PDFs featuring the official GHSS Shangus crest, student photo, details, and cryptographic verification QR code.</w:t>
+      </w:r>
+    </w:p>
+    <w:p>
+      <w:pPr>
+        <w:pStyle w:val="ListParagraph"/>
+        <w:numPr>
+          <w:ilvl w:val="0"/>
+          <w:numId w:val="1"/>
+        </w:numPr>
+        <w:spacing w:before="40" w:after="60"/>
+      </w:pPr>
+      <w:r>
+        <w:rPr>
+          <w:b/>
+          <w:bCs/>
+          <w:color w:val="0F3460"/>
+        </w:rPr>
+        <w:t xml:space="preserve">Fee Receipts &amp; Financial Transparency: </w:t>
+      </w:r>
+      <w:r>
+        <w:rPr>
+          <w:color w:val="334155"/>
+        </w:rPr>
+        <w:t xml:space="preserve">Instant generation and download of official school fee receipts with transaction serial numbers and payment confirmations.</w:t>
+      </w:r>
+    </w:p>
+    <w:p>
+      <w:pPr>
+        <w:pStyle w:val="ListParagraph"/>
+        <w:numPr>
+          <w:ilvl w:val="0"/>
+          <w:numId w:val="1"/>
+        </w:numPr>
+        <w:spacing w:before="40" w:after="60"/>
+      </w:pPr>
+      <w:r>
+        <w:rPr>
+          <w:b/>
+          <w:bCs/>
+          <w:color w:val="0F3460"/>
+        </w:rPr>
+        <w:t xml:space="preserve">Student Profile Self-Service: </w:t>
+      </w:r>
+      <w:r>
+        <w:rPr>
+          <w:color w:val="334155"/>
+        </w:rPr>
+        <w:t xml:space="preserve">Allows students to update mobile contact numbers, permanent residence, and emergency details, alongside rate-limited email verification and audited application withdrawal.</w:t>
+      </w:r>
+    </w:p>
+    <w:p>
+      <w:pPr>
+        <w:pStyle w:val="ListParagraph"/>
+        <w:numPr>
+          <w:ilvl w:val="0"/>
+          <w:numId w:val="1"/>
+        </w:numPr>
+        <w:spacing w:before="40" w:after="60"/>
+      </w:pPr>
+      <w:r>
+        <w:rPr>
+          <w:b/>
+          <w:bCs/>
+          <w:color w:val="0F3460"/>
+        </w:rPr>
+        <w:t xml:space="preserve">Instant SWR Cache Acceleration: </w:t>
+      </w:r>
+      <w:r>
+        <w:rPr>
+          <w:color w:val="334155"/>
+        </w:rPr>
+        <w:t xml:space="preserve">Subsequent visits load the student dashboard in under 50 milliseconds directly from local memory without waiting for network fetches.</w:t>
+      </w:r>
+    </w:p>
+    <w:p>
+      <w:pPr>
+        <w:spacing w:before="160"/>
+      </w:pPr>
+    </w:p>
+    <w:p>
+      <w:pPr>
+        <w:pStyle w:val="Heading1"/>
+        <w:spacing w:before="280" w:after="120"/>
+      </w:pPr>
+      <w:r>
+        <w:t xml:space="preserve">Teacher &amp; Faculty Academic Suite Capabilities</w:t>
+      </w:r>
+    </w:p>
+    <w:p>
+      <w:r>
+        <w:rPr>
+          <w:color w:val="334155"/>
+        </w:rPr>
+        <w:t xml:space="preserve">The Teacher Portal eliminates clerical friction, empowering faculty to focus on teaching while managing marks and attendance effortlessly:</w:t>
+      </w:r>
+    </w:p>
+    <w:p>
+      <w:pPr>
+        <w:pStyle w:val="ListParagraph"/>
+        <w:numPr>
+          <w:ilvl w:val="0"/>
+          <w:numId w:val="1"/>
+        </w:numPr>
+        <w:spacing w:before="40" w:after="60"/>
+      </w:pPr>
+      <w:r>
+        <w:rPr>
+          <w:b/>
+          <w:bCs/>
+          <w:color w:val="0F3460"/>
+        </w:rPr>
+        <w:t xml:space="preserve">Faculty Workspace &amp; Assigned Cohorts: </w:t>
+      </w:r>
+      <w:r>
+        <w:rPr>
+          <w:color w:val="334155"/>
+        </w:rPr>
+        <w:t xml:space="preserve">Teachers access an authenticated dashboard pre-mapped to their assigned classes (11th &amp; 12th), streams, and subjects (Physics, Chemistry, Biology, Computer Science, Geography, etc.).</w:t>
+      </w:r>
+    </w:p>
+    <w:p>
+      <w:pPr>
+        <w:pStyle w:val="ListParagraph"/>
+        <w:numPr>
+          <w:ilvl w:val="0"/>
+          <w:numId w:val="1"/>
+        </w:numPr>
+        <w:spacing w:before="40" w:after="60"/>
+      </w:pPr>
+      <w:r>
+        <w:rPr>
+          <w:b/>
+          <w:bCs/>
+          <w:color w:val="0F3460"/>
+        </w:rPr>
+        <w:t xml:space="preserve">Practical &amp; Internal Assessment Marks Engine: </w:t>
+      </w:r>
+      <w:r>
+        <w:rPr>
+          <w:color w:val="334155"/>
+        </w:rPr>
+        <w:t xml:space="preserve">Interactive marks entry table pre-populated with enrolled students. Features real-time score validation against maximum marks (e.g. max 20, max 30) to eliminate clerical over-scoring errors.</w:t>
+      </w:r>
+    </w:p>
+    <w:p>
+      <w:pPr>
+        <w:pStyle w:val="ListParagraph"/>
+        <w:numPr>
+          <w:ilvl w:val="0"/>
+          <w:numId w:val="1"/>
+        </w:numPr>
+        <w:spacing w:before="40" w:after="60"/>
+      </w:pPr>
+      <w:r>
+        <w:rPr>
+          <w:b/>
+          <w:bCs/>
+          <w:color w:val="0F3460"/>
+        </w:rPr>
+        <w:t xml:space="preserve">Autosave &amp; Draft Protection: </w:t>
+      </w:r>
+      <w:r>
+        <w:rPr>
+          <w:color w:val="334155"/>
+        </w:rPr>
+        <w:t xml:space="preserve">Automatic background saving protects faculty work against power cuts or cellular dropouts in rural areas, allowing teachers to resume anytime.</w:t>
+      </w:r>
+    </w:p>
+    <w:p>
+      <w:pPr>
+        <w:pStyle w:val="ListParagraph"/>
+        <w:numPr>
+          <w:ilvl w:val="0"/>
+          <w:numId w:val="1"/>
+        </w:numPr>
+        <w:spacing w:before="40" w:after="60"/>
+      </w:pPr>
+      <w:r>
+        <w:rPr>
+          <w:b/>
+          <w:bCs/>
+          <w:color w:val="0F3460"/>
+        </w:rPr>
+        <w:t xml:space="preserve">Dual-Format Official Award Rolls (.docx &amp; PDF): </w:t>
+      </w:r>
+      <w:r>
+        <w:rPr>
+          <w:color w:val="334155"/>
+        </w:rPr>
+        <w:t xml:space="preserve">One-click generation of official Two-Column Attendance Rosters and Award Rolls in both native Microsoft Word (.docx) and high-resolution PDF with official school headers, dates, and examiner signature blocks.</w:t>
+      </w:r>
+    </w:p>
+    <w:p>
+      <w:pPr>
+        <w:pStyle w:val="ListParagraph"/>
+        <w:numPr>
+          <w:ilvl w:val="0"/>
+          <w:numId w:val="1"/>
+        </w:numPr>
+        <w:spacing w:before="40" w:after="60"/>
+      </w:pPr>
+      <w:r>
+        <w:rPr>
+          <w:b/>
+          <w:bCs/>
+          <w:color w:val="0F3460"/>
+        </w:rPr>
+        <w:t xml:space="preserve">Final Submission &amp; Award Freeze: </w:t>
+      </w:r>
+      <w:r>
+        <w:rPr>
+          <w:color w:val="334155"/>
+        </w:rPr>
+        <w:t xml:space="preserve">Once marks are submitted to the Examination Cell, the roster is cryptographically locked to prevent unauthorized tampering.</w:t>
+      </w:r>
+    </w:p>
+    <w:p>
+      <w:pPr>
+        <w:pStyle w:val="ListParagraph"/>
+        <w:numPr>
+          <w:ilvl w:val="0"/>
+          <w:numId w:val="1"/>
+        </w:numPr>
+        <w:spacing w:before="40" w:after="60"/>
+      </w:pPr>
+      <w:r>
+        <w:rPr>
+          <w:b/>
+          <w:bCs/>
+          <w:color w:val="0F3460"/>
+        </w:rPr>
+        <w:t xml:space="preserve">Student Attendance Management: </w:t>
+      </w:r>
+      <w:r>
+        <w:rPr>
+          <w:color w:val="334155"/>
+        </w:rPr>
+        <w:t xml:space="preserve">Daily period-wise and class-wise attendance marking with a 1-click "Mark All Present" toggle and individual absent/leave overrides.</w:t>
+      </w:r>
+    </w:p>
+    <w:p>
+      <w:pPr>
+        <w:pStyle w:val="ListParagraph"/>
+        <w:numPr>
+          <w:ilvl w:val="0"/>
+          <w:numId w:val="1"/>
+        </w:numPr>
+        <w:spacing w:before="40" w:after="60"/>
+      </w:pPr>
+      <w:r>
+        <w:rPr>
+          <w:b/>
+          <w:bCs/>
+          <w:color w:val="0F3460"/>
+        </w:rPr>
+        <w:t xml:space="preserve">Automatic Shortage &amp; Eligibility Tracking: </w:t>
+      </w:r>
+      <w:r>
+        <w:rPr>
+          <w:color w:val="334155"/>
+        </w:rPr>
+        <w:t xml:space="preserve">Aggregates monthly attendance percentages automatically, highlighting students below the 75% threshold required for board examination eligibility.</w:t>
+      </w:r>
+    </w:p>
+    <w:p>
+      <w:pPr>
+        <w:pStyle w:val="ListParagraph"/>
+        <w:numPr>
+          <w:ilvl w:val="0"/>
+          <w:numId w:val="1"/>
+        </w:numPr>
+        <w:spacing w:before="40" w:after="60"/>
+      </w:pPr>
+      <w:r>
+        <w:rPr>
+          <w:b/>
+          <w:bCs/>
+          <w:color w:val="0F3460"/>
+        </w:rPr>
+        <w:t xml:space="preserve">Submission History &amp; Audit Trail: </w:t>
+      </w:r>
+      <w:r>
+        <w:rPr>
+          <w:color w:val="334155"/>
+        </w:rPr>
+        <w:t xml:space="preserve">Searchable history modal showing every practical submission, timestamped with date, class, subject, and student count, with 1-click Force Sync for real-time cloud data.</w:t>
+      </w:r>
+    </w:p>
+    <w:p>
+      <w:pPr>
+        <w:spacing w:before="160"/>
+      </w:pPr>
+    </w:p>
+    <w:p>
+      <w:pPr>
+        <w:pStyle w:val="Heading1"/>
+        <w:spacing w:before="280" w:after="120"/>
+      </w:pPr>
+      <w:r>
         <w:t xml:space="preserve">Comprehensive Classified Directory of 20 Administrative Modules</w:t>
       </w:r>
     </w:p>
@@ -268,7 +696,7 @@
         <w:rPr>
           <w:color w:val="334155"/>
         </w:rPr>
-        <w:t xml:space="preserve">The administrative architecture is systematically classified into 4 functional divisions comprising 20 production-ready tools:</w:t>
+        <w:t xml:space="preserve">The administrative command center is systematically classified into 4 functional divisions comprising 20 production-ready tools:</w:t>
       </w:r>
     </w:p>
     <w:p>
@@ -502,7 +930,7 @@
         <w:rPr>
           <w:color w:val="334155"/>
         </w:rPr>
-        <w:t xml:space="preserve">Empowers practical examiners and subject teachers to enter internal/practical marks. Features live validation against maximum marks, marks freeze/lockout safeguards, and automatic generation of official Two-Column Attendance Rosters and Award Rolls in both native Word (.docx) and PDF formats.</w:t>
+        <w:t xml:space="preserve">Consolidates internal/practical marks across departments, enforces locking safeguards, and generates board-compliant consolidated award rosters.</w:t>
       </w:r>
     </w:p>
     <w:p>
@@ -526,7 +954,7 @@
         <w:rPr>
           <w:color w:val="334155"/>
         </w:rPr>
-        <w:t xml:space="preserve">Digital attendance registers enabling daily period-wise or day-wise attendance logging, aggregate monthly attendance tracking, shortage alerts, and parent notification reports.</w:t>
+        <w:t xml:space="preserve">School-wide attendance analytics, section-wise aggregate tracking, shortage monitoring, and parent notification integration.</w:t>
       </w:r>
     </w:p>
     <w:p>

</xml_diff>